<commit_message>
docs: embed actual UI screenshots into Chapter 6 of academic report
</commit_message>
<xml_diff>
--- a/docs/Vehicle_Rental_DBMS_Report.docx
+++ b/docs/Vehicle_Rental_DBMS_Report.docx
@@ -7417,7 +7417,7 @@
           <w:color w:val="334155"/>
           <w:sz w:val="25"/>
         </w:rPr>
-        <w:t>Login Interface (`ui-kit/login.html`)</w:t>
+        <w:t>Login Interface</w:t>
       </w:r>
     </w:p>
     <w:p>
@@ -7436,48 +7436,60 @@
         <w:t>Staff login interface with email/password authentication and role credential validation.</w:t>
       </w:r>
     </w:p>
-    <w:tbl>
-      <w:tblPr>
-        <w:tblW w:type="auto" w:w="0"/>
+    <w:p>
+      <w:pPr>
+        <w:spacing w:before="160" w:after="80"/>
         <w:jc w:val="center"/>
-        <w:tblLook w:firstColumn="1" w:firstRow="1" w:lastColumn="0" w:lastRow="0" w:noHBand="0" w:noVBand="1" w:val="04A0"/>
-      </w:tblPr>
-      <w:tblGrid>
-        <w:gridCol w:w="9360"/>
-      </w:tblGrid>
-      <w:tr>
-        <w:tc>
-          <w:tcPr>
-            <w:tcW w:type="dxa" w:w="8352"/>
-            <w:shd w:fill="F1F5F9"/>
-            <w:tcMar>
-              <w:top w:w="400" w:type="dxa"/>
-              <w:bottom w:w="400" w:type="dxa"/>
-              <w:left w:w="300" w:type="dxa"/>
-              <w:right w:w="300" w:type="dxa"/>
-            </w:tcMar>
-          </w:tcPr>
-          <w:p>
-            <w:pPr>
-              <w:jc w:val="center"/>
-            </w:pPr>
-            <w:r>
-              <w:rPr>
-                <w:rFonts w:ascii="Times New Roman" w:hAnsi="Times New Roman"/>
-                <w:i/>
-                <w:color w:val="64748B"/>
-                <w:sz w:val="20"/>
-              </w:rPr>
-              <w:br/>
-              <w:t>[ SCREENSHOT PLACEHOLDER: Insert image of Login Interface (`ui-kit/login.html`) here ]</w:t>
-              <w:br/>
-              <w:t>(Open `ui-kit/login.html` in browser, capture screenshot, and paste here)</w:t>
-              <w:br/>
-            </w:r>
-          </w:p>
-        </w:tc>
-      </w:tr>
-    </w:tbl>
+      </w:pPr>
+      <w:r>
+        <w:drawing>
+          <wp:inline xmlns:a="http://schemas.openxmlformats.org/drawingml/2006/main" xmlns:pic="http://schemas.openxmlformats.org/drawingml/2006/picture">
+            <wp:extent cx="5486400" cy="3514725"/>
+            <wp:docPr id="7" name="Picture 7"/>
+            <wp:cNvGraphicFramePr>
+              <a:graphicFrameLocks noChangeAspect="1"/>
+            </wp:cNvGraphicFramePr>
+            <a:graphic>
+              <a:graphicData uri="http://schemas.openxmlformats.org/drawingml/2006/picture">
+                <pic:pic>
+                  <pic:nvPicPr>
+                    <pic:cNvPr id="0" name="screenshot_login.png"/>
+                    <pic:cNvPicPr/>
+                  </pic:nvPicPr>
+                  <pic:blipFill>
+                    <a:blip r:embed="rId14"/>
+                    <a:stretch>
+                      <a:fillRect/>
+                    </a:stretch>
+                  </pic:blipFill>
+                  <pic:spPr>
+                    <a:xfrm>
+                      <a:off x="0" y="0"/>
+                      <a:ext cx="5486400" cy="3514725"/>
+                    </a:xfrm>
+                    <a:prstGeom prst="rect"/>
+                  </pic:spPr>
+                </pic:pic>
+              </a:graphicData>
+            </a:graphic>
+          </wp:inline>
+        </w:drawing>
+      </w:r>
+    </w:p>
+    <w:p>
+      <w:pPr>
+        <w:spacing w:after="200"/>
+        <w:jc w:val="center"/>
+      </w:pPr>
+      <w:r>
+        <w:rPr>
+          <w:rFonts w:ascii="Times New Roman" w:hAnsi="Times New Roman"/>
+          <w:i/>
+          <w:sz w:val="20"/>
+        </w:rPr>
+        <w:t>Figure: Login Interface</w:t>
+      </w:r>
+    </w:p>
     <w:p>
       <w:pPr>
         <w:spacing w:before="0" w:after="120" w:line="276" w:lineRule="auto"/>
@@ -7506,7 +7518,7 @@
           <w:color w:val="334155"/>
           <w:sz w:val="25"/>
         </w:rPr>
-        <w:t>Executive Dashboard (`ui-kit/dashboard.html`)</w:t>
+        <w:t>Executive Dashboard</w:t>
       </w:r>
     </w:p>
     <w:p>
@@ -7525,48 +7537,60 @@
         <w:t>Real-time fleet KPI metrics, monthly revenue trend, available vehicles list, and overdue return alerts.</w:t>
       </w:r>
     </w:p>
-    <w:tbl>
-      <w:tblPr>
-        <w:tblW w:type="auto" w:w="0"/>
+    <w:p>
+      <w:pPr>
+        <w:spacing w:before="160" w:after="80"/>
         <w:jc w:val="center"/>
-        <w:tblLook w:firstColumn="1" w:firstRow="1" w:lastColumn="0" w:lastRow="0" w:noHBand="0" w:noVBand="1" w:val="04A0"/>
-      </w:tblPr>
-      <w:tblGrid>
-        <w:gridCol w:w="9360"/>
-      </w:tblGrid>
-      <w:tr>
-        <w:tc>
-          <w:tcPr>
-            <w:tcW w:type="dxa" w:w="8352"/>
-            <w:shd w:fill="F1F5F9"/>
-            <w:tcMar>
-              <w:top w:w="400" w:type="dxa"/>
-              <w:bottom w:w="400" w:type="dxa"/>
-              <w:left w:w="300" w:type="dxa"/>
-              <w:right w:w="300" w:type="dxa"/>
-            </w:tcMar>
-          </w:tcPr>
-          <w:p>
-            <w:pPr>
-              <w:jc w:val="center"/>
-            </w:pPr>
-            <w:r>
-              <w:rPr>
-                <w:rFonts w:ascii="Times New Roman" w:hAnsi="Times New Roman"/>
-                <w:i/>
-                <w:color w:val="64748B"/>
-                <w:sz w:val="20"/>
-              </w:rPr>
-              <w:br/>
-              <w:t>[ SCREENSHOT PLACEHOLDER: Insert image of Executive Dashboard (`ui-kit/dashboard.html`) here ]</w:t>
-              <w:br/>
-              <w:t>(Open `ui-kit/dashboard.html` in browser, capture screenshot, and paste here)</w:t>
-              <w:br/>
-            </w:r>
-          </w:p>
-        </w:tc>
-      </w:tr>
-    </w:tbl>
+      </w:pPr>
+      <w:r>
+        <w:drawing>
+          <wp:inline xmlns:a="http://schemas.openxmlformats.org/drawingml/2006/main" xmlns:pic="http://schemas.openxmlformats.org/drawingml/2006/picture">
+            <wp:extent cx="5486400" cy="3514725"/>
+            <wp:docPr id="8" name="Picture 8"/>
+            <wp:cNvGraphicFramePr>
+              <a:graphicFrameLocks noChangeAspect="1"/>
+            </wp:cNvGraphicFramePr>
+            <a:graphic>
+              <a:graphicData uri="http://schemas.openxmlformats.org/drawingml/2006/picture">
+                <pic:pic>
+                  <pic:nvPicPr>
+                    <pic:cNvPr id="0" name="screenshot_dashboard.png"/>
+                    <pic:cNvPicPr/>
+                  </pic:nvPicPr>
+                  <pic:blipFill>
+                    <a:blip r:embed="rId15"/>
+                    <a:stretch>
+                      <a:fillRect/>
+                    </a:stretch>
+                  </pic:blipFill>
+                  <pic:spPr>
+                    <a:xfrm>
+                      <a:off x="0" y="0"/>
+                      <a:ext cx="5486400" cy="3514725"/>
+                    </a:xfrm>
+                    <a:prstGeom prst="rect"/>
+                  </pic:spPr>
+                </pic:pic>
+              </a:graphicData>
+            </a:graphic>
+          </wp:inline>
+        </w:drawing>
+      </w:r>
+    </w:p>
+    <w:p>
+      <w:pPr>
+        <w:spacing w:after="200"/>
+        <w:jc w:val="center"/>
+      </w:pPr>
+      <w:r>
+        <w:rPr>
+          <w:rFonts w:ascii="Times New Roman" w:hAnsi="Times New Roman"/>
+          <w:i/>
+          <w:sz w:val="20"/>
+        </w:rPr>
+        <w:t>Figure: Executive Dashboard</w:t>
+      </w:r>
+    </w:p>
     <w:p>
       <w:pPr>
         <w:spacing w:before="0" w:after="120" w:line="276" w:lineRule="auto"/>
@@ -7595,7 +7619,7 @@
           <w:color w:val="334155"/>
           <w:sz w:val="25"/>
         </w:rPr>
-        <w:t>Vehicle Fleet Management (`ui-kit/vehicles.html`)</w:t>
+        <w:t>Vehicle Fleet Management</w:t>
       </w:r>
     </w:p>
     <w:p>
@@ -7614,48 +7638,60 @@
         <w:t>Tabular fleet directory with category filters, status badges (Available, Rented, In Shop), and detail view links.</w:t>
       </w:r>
     </w:p>
-    <w:tbl>
-      <w:tblPr>
-        <w:tblW w:type="auto" w:w="0"/>
+    <w:p>
+      <w:pPr>
+        <w:spacing w:before="160" w:after="80"/>
         <w:jc w:val="center"/>
-        <w:tblLook w:firstColumn="1" w:firstRow="1" w:lastColumn="0" w:lastRow="0" w:noHBand="0" w:noVBand="1" w:val="04A0"/>
-      </w:tblPr>
-      <w:tblGrid>
-        <w:gridCol w:w="9360"/>
-      </w:tblGrid>
-      <w:tr>
-        <w:tc>
-          <w:tcPr>
-            <w:tcW w:type="dxa" w:w="8352"/>
-            <w:shd w:fill="F1F5F9"/>
-            <w:tcMar>
-              <w:top w:w="400" w:type="dxa"/>
-              <w:bottom w:w="400" w:type="dxa"/>
-              <w:left w:w="300" w:type="dxa"/>
-              <w:right w:w="300" w:type="dxa"/>
-            </w:tcMar>
-          </w:tcPr>
-          <w:p>
-            <w:pPr>
-              <w:jc w:val="center"/>
-            </w:pPr>
-            <w:r>
-              <w:rPr>
-                <w:rFonts w:ascii="Times New Roman" w:hAnsi="Times New Roman"/>
-                <w:i/>
-                <w:color w:val="64748B"/>
-                <w:sz w:val="20"/>
-              </w:rPr>
-              <w:br/>
-              <w:t>[ SCREENSHOT PLACEHOLDER: Insert image of Vehicle Fleet Management (`ui-kit/vehicles.html`) here ]</w:t>
-              <w:br/>
-              <w:t>(Open `ui-kit/vehicles.html` in browser, capture screenshot, and paste here)</w:t>
-              <w:br/>
-            </w:r>
-          </w:p>
-        </w:tc>
-      </w:tr>
-    </w:tbl>
+      </w:pPr>
+      <w:r>
+        <w:drawing>
+          <wp:inline xmlns:a="http://schemas.openxmlformats.org/drawingml/2006/main" xmlns:pic="http://schemas.openxmlformats.org/drawingml/2006/picture">
+            <wp:extent cx="5486400" cy="3514725"/>
+            <wp:docPr id="9" name="Picture 9"/>
+            <wp:cNvGraphicFramePr>
+              <a:graphicFrameLocks noChangeAspect="1"/>
+            </wp:cNvGraphicFramePr>
+            <a:graphic>
+              <a:graphicData uri="http://schemas.openxmlformats.org/drawingml/2006/picture">
+                <pic:pic>
+                  <pic:nvPicPr>
+                    <pic:cNvPr id="0" name="screenshot_vehicles.png"/>
+                    <pic:cNvPicPr/>
+                  </pic:nvPicPr>
+                  <pic:blipFill>
+                    <a:blip r:embed="rId16"/>
+                    <a:stretch>
+                      <a:fillRect/>
+                    </a:stretch>
+                  </pic:blipFill>
+                  <pic:spPr>
+                    <a:xfrm>
+                      <a:off x="0" y="0"/>
+                      <a:ext cx="5486400" cy="3514725"/>
+                    </a:xfrm>
+                    <a:prstGeom prst="rect"/>
+                  </pic:spPr>
+                </pic:pic>
+              </a:graphicData>
+            </a:graphic>
+          </wp:inline>
+        </w:drawing>
+      </w:r>
+    </w:p>
+    <w:p>
+      <w:pPr>
+        <w:spacing w:after="200"/>
+        <w:jc w:val="center"/>
+      </w:pPr>
+      <w:r>
+        <w:rPr>
+          <w:rFonts w:ascii="Times New Roman" w:hAnsi="Times New Roman"/>
+          <w:i/>
+          <w:sz w:val="20"/>
+        </w:rPr>
+        <w:t>Figure: Vehicle Fleet Management</w:t>
+      </w:r>
+    </w:p>
     <w:p>
       <w:pPr>
         <w:spacing w:before="0" w:after="120" w:line="276" w:lineRule="auto"/>
@@ -7684,7 +7720,7 @@
           <w:color w:val="334155"/>
           <w:sz w:val="25"/>
         </w:rPr>
-        <w:t>Reservation &amp; Bookings Hub (`ui-kit/bookings.html`)</w:t>
+        <w:t>Reservation &amp; Bookings Hub</w:t>
       </w:r>
     </w:p>
     <w:p>
@@ -7703,48 +7739,60 @@
         <w:t>Booking management screen showing active/completed rentals, calculated charges, and lifecycle transition triggers.</w:t>
       </w:r>
     </w:p>
-    <w:tbl>
-      <w:tblPr>
-        <w:tblW w:type="auto" w:w="0"/>
+    <w:p>
+      <w:pPr>
+        <w:spacing w:before="160" w:after="80"/>
         <w:jc w:val="center"/>
-        <w:tblLook w:firstColumn="1" w:firstRow="1" w:lastColumn="0" w:lastRow="0" w:noHBand="0" w:noVBand="1" w:val="04A0"/>
-      </w:tblPr>
-      <w:tblGrid>
-        <w:gridCol w:w="9360"/>
-      </w:tblGrid>
-      <w:tr>
-        <w:tc>
-          <w:tcPr>
-            <w:tcW w:type="dxa" w:w="8352"/>
-            <w:shd w:fill="F1F5F9"/>
-            <w:tcMar>
-              <w:top w:w="400" w:type="dxa"/>
-              <w:bottom w:w="400" w:type="dxa"/>
-              <w:left w:w="300" w:type="dxa"/>
-              <w:right w:w="300" w:type="dxa"/>
-            </w:tcMar>
-          </w:tcPr>
-          <w:p>
-            <w:pPr>
-              <w:jc w:val="center"/>
-            </w:pPr>
-            <w:r>
-              <w:rPr>
-                <w:rFonts w:ascii="Times New Roman" w:hAnsi="Times New Roman"/>
-                <w:i/>
-                <w:color w:val="64748B"/>
-                <w:sz w:val="20"/>
-              </w:rPr>
-              <w:br/>
-              <w:t>[ SCREENSHOT PLACEHOLDER: Insert image of Reservation &amp; Bookings Hub (`ui-kit/bookings.html`) here ]</w:t>
-              <w:br/>
-              <w:t>(Open `ui-kit/bookings.html` in browser, capture screenshot, and paste here)</w:t>
-              <w:br/>
-            </w:r>
-          </w:p>
-        </w:tc>
-      </w:tr>
-    </w:tbl>
+      </w:pPr>
+      <w:r>
+        <w:drawing>
+          <wp:inline xmlns:a="http://schemas.openxmlformats.org/drawingml/2006/main" xmlns:pic="http://schemas.openxmlformats.org/drawingml/2006/picture">
+            <wp:extent cx="5486400" cy="3514725"/>
+            <wp:docPr id="10" name="Picture 10"/>
+            <wp:cNvGraphicFramePr>
+              <a:graphicFrameLocks noChangeAspect="1"/>
+            </wp:cNvGraphicFramePr>
+            <a:graphic>
+              <a:graphicData uri="http://schemas.openxmlformats.org/drawingml/2006/picture">
+                <pic:pic>
+                  <pic:nvPicPr>
+                    <pic:cNvPr id="0" name="screenshot_bookings.png"/>
+                    <pic:cNvPicPr/>
+                  </pic:nvPicPr>
+                  <pic:blipFill>
+                    <a:blip r:embed="rId17"/>
+                    <a:stretch>
+                      <a:fillRect/>
+                    </a:stretch>
+                  </pic:blipFill>
+                  <pic:spPr>
+                    <a:xfrm>
+                      <a:off x="0" y="0"/>
+                      <a:ext cx="5486400" cy="3514725"/>
+                    </a:xfrm>
+                    <a:prstGeom prst="rect"/>
+                  </pic:spPr>
+                </pic:pic>
+              </a:graphicData>
+            </a:graphic>
+          </wp:inline>
+        </w:drawing>
+      </w:r>
+    </w:p>
+    <w:p>
+      <w:pPr>
+        <w:spacing w:after="200"/>
+        <w:jc w:val="center"/>
+      </w:pPr>
+      <w:r>
+        <w:rPr>
+          <w:rFonts w:ascii="Times New Roman" w:hAnsi="Times New Roman"/>
+          <w:i/>
+          <w:sz w:val="20"/>
+        </w:rPr>
+        <w:t>Figure: Reservation &amp; Bookings Hub</w:t>
+      </w:r>
+    </w:p>
     <w:p>
       <w:pPr>
         <w:spacing w:before="0" w:after="120" w:line="276" w:lineRule="auto"/>
@@ -7773,7 +7821,7 @@
           <w:color w:val="334155"/>
           <w:sz w:val="25"/>
         </w:rPr>
-        <w:t>New Booking &amp; Customer Form (`ui-kit/form.html`)</w:t>
+        <w:t>New Booking &amp; Customer Form</w:t>
       </w:r>
     </w:p>
     <w:p>
@@ -7792,48 +7840,60 @@
         <w:t>Modal dialog for customer onboarding and new reservation checkout with live rate calculation.</w:t>
       </w:r>
     </w:p>
-    <w:tbl>
-      <w:tblPr>
-        <w:tblW w:type="auto" w:w="0"/>
+    <w:p>
+      <w:pPr>
+        <w:spacing w:before="160" w:after="80"/>
         <w:jc w:val="center"/>
-        <w:tblLook w:firstColumn="1" w:firstRow="1" w:lastColumn="0" w:lastRow="0" w:noHBand="0" w:noVBand="1" w:val="04A0"/>
-      </w:tblPr>
-      <w:tblGrid>
-        <w:gridCol w:w="9360"/>
-      </w:tblGrid>
-      <w:tr>
-        <w:tc>
-          <w:tcPr>
-            <w:tcW w:type="dxa" w:w="8352"/>
-            <w:shd w:fill="F1F5F9"/>
-            <w:tcMar>
-              <w:top w:w="400" w:type="dxa"/>
-              <w:bottom w:w="400" w:type="dxa"/>
-              <w:left w:w="300" w:type="dxa"/>
-              <w:right w:w="300" w:type="dxa"/>
-            </w:tcMar>
-          </w:tcPr>
-          <w:p>
-            <w:pPr>
-              <w:jc w:val="center"/>
-            </w:pPr>
-            <w:r>
-              <w:rPr>
-                <w:rFonts w:ascii="Times New Roman" w:hAnsi="Times New Roman"/>
-                <w:i/>
-                <w:color w:val="64748B"/>
-                <w:sz w:val="20"/>
-              </w:rPr>
-              <w:br/>
-              <w:t>[ SCREENSHOT PLACEHOLDER: Insert image of New Booking &amp; Customer Form (`ui-kit/form.html`) here ]</w:t>
-              <w:br/>
-              <w:t>(Open `ui-kit/form.html` in browser, capture screenshot, and paste here)</w:t>
-              <w:br/>
-            </w:r>
-          </w:p>
-        </w:tc>
-      </w:tr>
-    </w:tbl>
+      </w:pPr>
+      <w:r>
+        <w:drawing>
+          <wp:inline xmlns:a="http://schemas.openxmlformats.org/drawingml/2006/main" xmlns:pic="http://schemas.openxmlformats.org/drawingml/2006/picture">
+            <wp:extent cx="5486400" cy="3514725"/>
+            <wp:docPr id="11" name="Picture 11"/>
+            <wp:cNvGraphicFramePr>
+              <a:graphicFrameLocks noChangeAspect="1"/>
+            </wp:cNvGraphicFramePr>
+            <a:graphic>
+              <a:graphicData uri="http://schemas.openxmlformats.org/drawingml/2006/picture">
+                <pic:pic>
+                  <pic:nvPicPr>
+                    <pic:cNvPr id="0" name="screenshot_form.png"/>
+                    <pic:cNvPicPr/>
+                  </pic:nvPicPr>
+                  <pic:blipFill>
+                    <a:blip r:embed="rId18"/>
+                    <a:stretch>
+                      <a:fillRect/>
+                    </a:stretch>
+                  </pic:blipFill>
+                  <pic:spPr>
+                    <a:xfrm>
+                      <a:off x="0" y="0"/>
+                      <a:ext cx="5486400" cy="3514725"/>
+                    </a:xfrm>
+                    <a:prstGeom prst="rect"/>
+                  </pic:spPr>
+                </pic:pic>
+              </a:graphicData>
+            </a:graphic>
+          </wp:inline>
+        </w:drawing>
+      </w:r>
+    </w:p>
+    <w:p>
+      <w:pPr>
+        <w:spacing w:after="200"/>
+        <w:jc w:val="center"/>
+      </w:pPr>
+      <w:r>
+        <w:rPr>
+          <w:rFonts w:ascii="Times New Roman" w:hAnsi="Times New Roman"/>
+          <w:i/>
+          <w:sz w:val="20"/>
+        </w:rPr>
+        <w:t>Figure: New Booking &amp; Customer Form</w:t>
+      </w:r>
+    </w:p>
     <w:p>
       <w:pPr>
         <w:spacing w:before="0" w:after="120" w:line="276" w:lineRule="auto"/>

</xml_diff>